<commit_message>
Let parents and the admin delete a declaration; reset a day's order
- Parent form: «Επαναφορά της …» under each day restores the first-visit
  (random) order; «Διαγραφή δήλωσης» deletes the saved declaration until
  the deadline (before the first submission: «Επαναφορά όλων των ημερών»).
- Admin, «Μαθητές» tab: «Διαγραφή» next to a declaration, until the
  allocation.
- New routes DELETE /api/parent/submission and
  DELETE /api/admin/submissions/:am, logged as submission_deleted.
- Help, parents' manual, SPEC, unit and e2e tests.

Co-Authored-By: Claude Opus 5.5 <noreply@anthropic.com>
Claude-Session: https://claude.ai/code/session_01SPfAxS6qf3opwntkiNvsQL
</commit_message>
<xml_diff>
--- a/docs/Egxeiridio_Goneis.docx
+++ b/docs/Egxeiridio_Goneis.docx
@@ -1055,6 +1055,98 @@
       </w:r>
       <w:r>
         <w:t xml:space="preserve">. Ισχύει η τελευταία αποθήκευση· ο κωδικός απόδειξης αλλάζει σε κάθε αλλαγή.</w:t>
+      </w:r>
+    </w:p>
+    <w:p>
+      <w:pPr>
+        <w:pStyle w:val="Compact"/>
+        <w:numPr>
+          <w:ilvl w:val="0"/>
+          <w:numId w:val="1007"/>
+        </w:numPr>
+      </w:pPr>
+      <w:r>
+        <w:rPr>
+          <w:b/>
+          <w:bCs/>
+        </w:rPr>
+        <w:t xml:space="preserve">Επαναφορά ημέρας:</w:t>
+      </w:r>
+      <w:r>
+        <w:t xml:space="preserve"> </w:t>
+      </w:r>
+      <w:r>
+        <w:t xml:space="preserve">κάτω από τη λίστα κάθε ημέρας, το κουμπί</w:t>
+      </w:r>
+      <w:r>
+        <w:t xml:space="preserve"> </w:t>
+      </w:r>
+      <w:r>
+        <w:rPr>
+          <w:b/>
+          <w:bCs/>
+        </w:rPr>
+        <w:t xml:space="preserve">«Επαναφορά …»</w:t>
+      </w:r>
+      <w:r>
+        <w:t xml:space="preserve"> </w:t>
+      </w:r>
+      <w:r>
+        <w:t xml:space="preserve">(π.χ. «Επαναφορά της Δευτέρας») ξαναφέρνει την αρχική σειρά της ημέρας. Η αλλαγή ισχύει όταν πατήσετε «Υποβολή δήλωσης» ή «Αποθήκευση αλλαγών».</w:t>
+      </w:r>
+    </w:p>
+    <w:p>
+      <w:pPr>
+        <w:pStyle w:val="Compact"/>
+        <w:numPr>
+          <w:ilvl w:val="0"/>
+          <w:numId w:val="1007"/>
+        </w:numPr>
+      </w:pPr>
+      <w:r>
+        <w:rPr>
+          <w:b/>
+          <w:bCs/>
+        </w:rPr>
+        <w:t xml:space="preserve">Διαγραφή δήλωσης:</w:t>
+      </w:r>
+      <w:r>
+        <w:t xml:space="preserve"> </w:t>
+      </w:r>
+      <w:r>
+        <w:t xml:space="preserve">μέχρι την προθεσμία, το κουμπί</w:t>
+      </w:r>
+      <w:r>
+        <w:t xml:space="preserve"> </w:t>
+      </w:r>
+      <w:r>
+        <w:rPr>
+          <w:b/>
+          <w:bCs/>
+        </w:rPr>
+        <w:t xml:space="preserve">«Διαγραφή δήλωσης»</w:t>
+      </w:r>
+      <w:r>
+        <w:t xml:space="preserve"> </w:t>
+      </w:r>
+      <w:r>
+        <w:t xml:space="preserve">(κάτω από τη φόρμα) διαγράφει την αποθηκευμένη δήλωση. Η φόρμα ξαναγίνεται όπως την πρώτη φορά και το παιδί</w:t>
+      </w:r>
+      <w:r>
+        <w:t xml:space="preserve"> </w:t>
+      </w:r>
+      <w:r>
+        <w:rPr>
+          <w:b/>
+          <w:bCs/>
+        </w:rPr>
+        <w:t xml:space="preserve">μένει χωρίς δήλωση</w:t>
+      </w:r>
+      <w:r>
+        <w:t xml:space="preserve"> </w:t>
+      </w:r>
+      <w:r>
+        <w:t xml:space="preserve">μέχρι να υποβάλετε νέα. Πριν από την πρώτη υποβολή, το ίδιο κουμπί λέγεται «Επαναφορά όλων των ημερών».</w:t>
       </w:r>
     </w:p>
     <w:p>

</xml_diff>

<commit_message>
Let the admin remove a club, also after declarations opened
A teacher may leave, fall ill, or the club may not be approved after
parents have already ranked it. «Κατάργηση» in the clubs tab removes the
club for good, until the allocation: it leaves every declaration (the
clubs after it move up one place, as last year's
archive/remove_club_interactive.R did), together with the teacher's list
and the teachers' club entries. The parent sees a note on the form and a
history entry; an earlier allocation is dropped. If the mandatory grades
no longer fit, the removal goes through with a warning. No change to the
algorithm or the R package: only the data change.

Co-Authored-By: Claude Opus 5.5 <noreply@anthropic.com>
Claude-Session: https://claude.ai/code/session_01ChfsCeRTGG1JLeELpKUSTy
</commit_message>
<xml_diff>
--- a/docs/Egxeiridio_Goneis.docx
+++ b/docs/Egxeiridio_Goneis.docx
@@ -4125,6 +4125,24 @@
       </w:r>
       <w:r>
         <w:t xml:space="preserve">Ο εκπαιδευτικός του ομίλου αποφάσισε, μετά τη δήλωσή σας, ότι ο όμιλος δεν απευθύνεται στο παιδί σας. Η δήλωσή σας ισχύει κανονικά: στην κατανομή ο όμιλος αυτός απλώς παραλείπεται και οι υπόλοιποι μένουν με τη σειρά που τους βάλατε. Δεν χρειάζεται να κάνετε κάτι, εκτός αν θέλετε να αλλάξετε τη σειρά.</w:t>
+      </w:r>
+    </w:p>
+    <w:p>
+      <w:pPr>
+        <w:pStyle w:val="BodyText"/>
+      </w:pPr>
+      <w:r>
+        <w:rPr>
+          <w:b/>
+          <w:bCs/>
+        </w:rPr>
+        <w:t xml:space="preserve">Η φόρμα λέει ότι ένας όμιλος που είχα δηλώσει «καταργήθηκε από το σχολείο». Τι γίνεται με τη δήλωσή μου;</w:t>
+      </w:r>
+      <w:r>
+        <w:t xml:space="preserve"> </w:t>
+      </w:r>
+      <w:r>
+        <w:t xml:space="preserve">Ο όμιλος δεν θα γίνει (π.χ. αποχώρησε ο εκπαιδευτικός του) και βγήκε από τη δήλωσή σας. Οι όμιλοι που είχατε βάλει μετά από αυτόν ανέβηκαν μία θέση· η σειρά τους μεταξύ τους έμεινε ίδια. Ο κωδικός της απόδειξης αλλάζει γι' αυτόν τον λόγο. Δεν χρειάζεται να κάνετε κάτι, εκτός αν θέλετε να αλλάξετε τη σειρά.</w:t>
       </w:r>
     </w:p>
     <w:p>

</xml_diff>

<commit_message>
Parent form: redraw when the clubs changed while the page was open
A teacher who lifts a closed list (or a ⛔) during the parents' phase makes
the club appear for students who could not see it before. A parent whose
form was already open still had the old club list, so the server refused
the submission with "missing clubs" and the parent had no way to rank the
new club without reloading and losing the unsaved order.

On a 422 from the submission, the form now reloads /api/parent/me; if the
clubs differ, it redraws with the current clubs, keeps the order that was
on screen, puts new clubs last and drops the ones no longer available,
with a message per day. The server's checks are unchanged.

Co-Authored-By: Claude Opus 5.5 <noreply@anthropic.com>
Claude-Session: https://claude.ai/code/session_01QMQaXT43LSBbUNjXkSg6UG
</commit_message>
<xml_diff>
--- a/docs/Egxeiridio_Goneis.docx
+++ b/docs/Egxeiridio_Goneis.docx
@@ -942,6 +942,30 @@
       </w:r>
       <w:r>
         <w:t xml:space="preserve">(στην τελευταία ημέρα). Αν δεν έχετε ανοίξει κάποια ημέρα, η πλατφόρμα θα σας το θυμίσει — εκεί θα έμενε η τυχαία σειρά.</w:t>
+      </w:r>
+    </w:p>
+    <w:p>
+      <w:pPr>
+        <w:pStyle w:val="BodyText"/>
+      </w:pPr>
+      <w:r>
+        <w:t xml:space="preserve">Σπάνια, οι όμιλοι αλλάζουν όσο έχετε ανοιχτή τη σελίδα (π.χ. ο εκπαιδευτικός ενός ομίλου ανοίγει τη λίστα του). Τότε η υποβολή δεν γίνεται: η φόρμα ενημερώνεται μόνη της,</w:t>
+      </w:r>
+      <w:r>
+        <w:t xml:space="preserve"> </w:t>
+      </w:r>
+      <w:r>
+        <w:rPr>
+          <w:b/>
+          <w:bCs/>
+        </w:rPr>
+        <w:t xml:space="preserve">κρατά τη σειρά σας</w:t>
+      </w:r>
+      <w:r>
+        <w:t xml:space="preserve"> </w:t>
+      </w:r>
+      <w:r>
+        <w:t xml:space="preserve">και βάζει τον νέο όμιλο στο τέλος της ημέρας του, με κίτρινο μήνυμα. Βάλτε τον στη θέση που θέλετε και πατήστε ξανά «Υποβολή δήλωσης».</w:t>
       </w:r>
     </w:p>
     <w:p>

</xml_diff>